<commit_message>
Updated docs 27th may
</commit_message>
<xml_diff>
--- a/flutter more documents/f21_flutter_extras_of_basic.docx
+++ b/flutter more documents/f21_flutter_extras_of_basic.docx
@@ -11872,770 +11872,6 @@
       <w:pPr>
         <w:jc w:val="both"/>
         <w:rPr>
-          <w:sz w:val="36"/>
-          <w:szCs w:val="36"/>
-        </w:rPr>
-      </w:pPr>
-      <w:r>
-        <w:rPr>
-          <w:sz w:val="36"/>
-          <w:szCs w:val="36"/>
-        </w:rPr>
-        <w:t>Flutter Performance Tips:</w:t>
-      </w:r>
-    </w:p>
-    <w:p>
-      <w:pPr>
-        <w:pStyle w:val="ListParagraph"/>
-        <w:numPr>
-          <w:ilvl w:val="0"/>
-          <w:numId w:val="7"/>
-        </w:numPr>
-        <w:jc w:val="both"/>
-        <w:rPr>
-          <w:sz w:val="36"/>
-          <w:szCs w:val="36"/>
-        </w:rPr>
-      </w:pPr>
-      <w:r>
-        <w:rPr>
-          <w:sz w:val="36"/>
-          <w:szCs w:val="36"/>
-        </w:rPr>
-        <w:t xml:space="preserve">Use const widgets wherever possible – fewer rebuilds = faster apps. </w:t>
-      </w:r>
-      <w:r>
-        <w:rPr>
-          <w:rFonts w:ascii="Segoe UI Emoji" w:hAnsi="Segoe UI Emoji" w:cs="Segoe UI Emoji"/>
-          <w:sz w:val="36"/>
-          <w:szCs w:val="36"/>
-        </w:rPr>
-        <w:t>⚡</w:t>
-      </w:r>
-    </w:p>
-    <w:p>
-      <w:pPr>
-        <w:pStyle w:val="ListParagraph"/>
-        <w:numPr>
-          <w:ilvl w:val="0"/>
-          <w:numId w:val="7"/>
-        </w:numPr>
-        <w:jc w:val="both"/>
-        <w:rPr>
-          <w:sz w:val="36"/>
-          <w:szCs w:val="36"/>
-        </w:rPr>
-      </w:pPr>
-      <w:r>
-        <w:rPr>
-          <w:sz w:val="36"/>
-          <w:szCs w:val="36"/>
-        </w:rPr>
-        <w:t xml:space="preserve">Rebuild only what’s needed – leverage keys, </w:t>
-      </w:r>
-      <w:proofErr w:type="spellStart"/>
-      <w:r>
-        <w:rPr>
-          <w:b/>
-          <w:bCs/>
-          <w:sz w:val="36"/>
-          <w:szCs w:val="36"/>
-        </w:rPr>
-        <w:t>ValueKey</w:t>
-      </w:r>
-      <w:proofErr w:type="spellEnd"/>
-      <w:r>
-        <w:rPr>
-          <w:sz w:val="36"/>
-          <w:szCs w:val="36"/>
-        </w:rPr>
-        <w:t xml:space="preserve">, or separate widgets. </w:t>
-      </w:r>
-      <w:r>
-        <w:rPr>
-          <w:rFonts w:ascii="Segoe UI Emoji" w:hAnsi="Segoe UI Emoji" w:cs="Segoe UI Emoji"/>
-          <w:sz w:val="36"/>
-          <w:szCs w:val="36"/>
-        </w:rPr>
-        <w:t>💡</w:t>
-      </w:r>
-    </w:p>
-    <w:p>
-      <w:pPr>
-        <w:pStyle w:val="ListParagraph"/>
-        <w:numPr>
-          <w:ilvl w:val="0"/>
-          <w:numId w:val="7"/>
-        </w:numPr>
-        <w:jc w:val="both"/>
-        <w:rPr>
-          <w:sz w:val="36"/>
-          <w:szCs w:val="36"/>
-        </w:rPr>
-      </w:pPr>
-      <w:r>
-        <w:rPr>
-          <w:sz w:val="36"/>
-          <w:szCs w:val="36"/>
-        </w:rPr>
-        <w:t xml:space="preserve">Efficient state management – prefer </w:t>
-      </w:r>
-      <w:proofErr w:type="spellStart"/>
-      <w:r>
-        <w:rPr>
-          <w:b/>
-          <w:bCs/>
-          <w:sz w:val="36"/>
-          <w:szCs w:val="36"/>
-        </w:rPr>
-        <w:t>GetX</w:t>
-      </w:r>
-      <w:proofErr w:type="spellEnd"/>
-      <w:r>
-        <w:rPr>
-          <w:sz w:val="36"/>
-          <w:szCs w:val="36"/>
-        </w:rPr>
-        <w:t xml:space="preserve">, </w:t>
-      </w:r>
-      <w:proofErr w:type="spellStart"/>
-      <w:r>
-        <w:rPr>
-          <w:b/>
-          <w:bCs/>
-          <w:sz w:val="36"/>
-          <w:szCs w:val="36"/>
-        </w:rPr>
-        <w:t>Riverpod</w:t>
-      </w:r>
-      <w:proofErr w:type="spellEnd"/>
-      <w:r>
-        <w:rPr>
-          <w:sz w:val="36"/>
-          <w:szCs w:val="36"/>
-        </w:rPr>
-        <w:t xml:space="preserve">, or Bloc over </w:t>
-      </w:r>
-      <w:proofErr w:type="spellStart"/>
-      <w:r>
-        <w:rPr>
-          <w:b/>
-          <w:bCs/>
-          <w:sz w:val="36"/>
-          <w:szCs w:val="36"/>
-        </w:rPr>
-        <w:t>setState</w:t>
-      </w:r>
-      <w:proofErr w:type="spellEnd"/>
-      <w:r>
-        <w:rPr>
-          <w:sz w:val="36"/>
-          <w:szCs w:val="36"/>
-        </w:rPr>
-        <w:t xml:space="preserve"> everywhere.</w:t>
-      </w:r>
-    </w:p>
-    <w:p>
-      <w:pPr>
-        <w:pStyle w:val="ListParagraph"/>
-        <w:numPr>
-          <w:ilvl w:val="0"/>
-          <w:numId w:val="7"/>
-        </w:numPr>
-        <w:jc w:val="both"/>
-        <w:rPr>
-          <w:sz w:val="36"/>
-          <w:szCs w:val="36"/>
-        </w:rPr>
-      </w:pPr>
-      <w:r>
-        <w:rPr>
-          <w:sz w:val="36"/>
-          <w:szCs w:val="36"/>
-        </w:rPr>
-        <w:t>Pagination &amp; lazy loading – don’t load all data at once; save memory.</w:t>
-      </w:r>
-    </w:p>
-    <w:p>
-      <w:pPr>
-        <w:pStyle w:val="ListParagraph"/>
-        <w:numPr>
-          <w:ilvl w:val="0"/>
-          <w:numId w:val="7"/>
-        </w:numPr>
-        <w:jc w:val="both"/>
-        <w:rPr>
-          <w:sz w:val="36"/>
-          <w:szCs w:val="36"/>
-        </w:rPr>
-      </w:pPr>
-      <w:r>
-        <w:rPr>
-          <w:sz w:val="36"/>
-          <w:szCs w:val="36"/>
-        </w:rPr>
-        <w:t xml:space="preserve">Builder widgets – </w:t>
-      </w:r>
-      <w:proofErr w:type="spellStart"/>
-      <w:r>
-        <w:rPr>
-          <w:b/>
-          <w:bCs/>
-          <w:sz w:val="36"/>
-          <w:szCs w:val="36"/>
-        </w:rPr>
-        <w:t>ListView.builder</w:t>
-      </w:r>
-      <w:proofErr w:type="spellEnd"/>
-      <w:r>
-        <w:rPr>
-          <w:sz w:val="36"/>
-          <w:szCs w:val="36"/>
-        </w:rPr>
-        <w:t xml:space="preserve"> or </w:t>
-      </w:r>
-      <w:proofErr w:type="spellStart"/>
-      <w:r>
-        <w:rPr>
-          <w:b/>
-          <w:bCs/>
-          <w:sz w:val="36"/>
-          <w:szCs w:val="36"/>
-        </w:rPr>
-        <w:t>GridView.builder</w:t>
-      </w:r>
-      <w:proofErr w:type="spellEnd"/>
-      <w:r>
-        <w:rPr>
-          <w:b/>
-          <w:bCs/>
-          <w:sz w:val="36"/>
-          <w:szCs w:val="36"/>
-        </w:rPr>
-        <w:t xml:space="preserve"> </w:t>
-      </w:r>
-      <w:r>
-        <w:rPr>
-          <w:sz w:val="36"/>
-          <w:szCs w:val="36"/>
-        </w:rPr>
-        <w:t>reduces memory usage.</w:t>
-      </w:r>
-    </w:p>
-    <w:p>
-      <w:pPr>
-        <w:pStyle w:val="ListParagraph"/>
-        <w:numPr>
-          <w:ilvl w:val="0"/>
-          <w:numId w:val="7"/>
-        </w:numPr>
-        <w:jc w:val="both"/>
-        <w:rPr>
-          <w:sz w:val="36"/>
-          <w:szCs w:val="36"/>
-        </w:rPr>
-      </w:pPr>
-      <w:r>
-        <w:rPr>
-          <w:sz w:val="36"/>
-          <w:szCs w:val="36"/>
-        </w:rPr>
-        <w:t xml:space="preserve">Optimize images – compress assets, scale properly, or use </w:t>
-      </w:r>
-      <w:proofErr w:type="spellStart"/>
-      <w:r>
-        <w:rPr>
-          <w:b/>
-          <w:bCs/>
-          <w:sz w:val="36"/>
-          <w:szCs w:val="36"/>
-        </w:rPr>
-        <w:t>CachedNetworkImage</w:t>
-      </w:r>
-      <w:proofErr w:type="spellEnd"/>
-      <w:r>
-        <w:rPr>
-          <w:sz w:val="36"/>
-          <w:szCs w:val="36"/>
-        </w:rPr>
-        <w:t>.</w:t>
-      </w:r>
-    </w:p>
-    <w:p>
-      <w:pPr>
-        <w:pStyle w:val="ListParagraph"/>
-        <w:numPr>
-          <w:ilvl w:val="0"/>
-          <w:numId w:val="7"/>
-        </w:numPr>
-        <w:jc w:val="both"/>
-        <w:rPr>
-          <w:sz w:val="36"/>
-          <w:szCs w:val="36"/>
-        </w:rPr>
-      </w:pPr>
-      <w:r>
-        <w:rPr>
-          <w:sz w:val="36"/>
-          <w:szCs w:val="36"/>
-        </w:rPr>
-        <w:t>Flatten widget trees – avoid deep nesting to reduce overdraw.</w:t>
-      </w:r>
-    </w:p>
-    <w:p>
-      <w:pPr>
-        <w:pStyle w:val="ListParagraph"/>
-        <w:numPr>
-          <w:ilvl w:val="0"/>
-          <w:numId w:val="7"/>
-        </w:numPr>
-        <w:jc w:val="both"/>
-        <w:rPr>
-          <w:sz w:val="36"/>
-          <w:szCs w:val="36"/>
-        </w:rPr>
-      </w:pPr>
-      <w:r>
-        <w:rPr>
-          <w:sz w:val="36"/>
-          <w:szCs w:val="36"/>
-        </w:rPr>
-        <w:t xml:space="preserve">Isolate heavy widgets – </w:t>
-      </w:r>
-      <w:proofErr w:type="spellStart"/>
-      <w:r>
-        <w:rPr>
-          <w:b/>
-          <w:bCs/>
-          <w:sz w:val="36"/>
-          <w:szCs w:val="36"/>
-        </w:rPr>
-        <w:t>RepaintBoundary</w:t>
-      </w:r>
-      <w:proofErr w:type="spellEnd"/>
-      <w:r>
-        <w:rPr>
-          <w:b/>
-          <w:bCs/>
-          <w:sz w:val="36"/>
-          <w:szCs w:val="36"/>
-        </w:rPr>
-        <w:t xml:space="preserve"> </w:t>
-      </w:r>
-      <w:r>
-        <w:rPr>
-          <w:sz w:val="36"/>
-          <w:szCs w:val="36"/>
-        </w:rPr>
-        <w:t>helps for charts or animations.</w:t>
-      </w:r>
-    </w:p>
-    <w:p>
-      <w:pPr>
-        <w:pStyle w:val="ListParagraph"/>
-        <w:numPr>
-          <w:ilvl w:val="0"/>
-          <w:numId w:val="7"/>
-        </w:numPr>
-        <w:jc w:val="both"/>
-        <w:rPr>
-          <w:sz w:val="36"/>
-          <w:szCs w:val="36"/>
-        </w:rPr>
-      </w:pPr>
-      <w:r>
-        <w:rPr>
-          <w:sz w:val="36"/>
-          <w:szCs w:val="36"/>
-        </w:rPr>
-        <w:t>Debounce user input – prevent flooding API calls from search bars.</w:t>
-      </w:r>
-    </w:p>
-    <w:p>
-      <w:pPr>
-        <w:pStyle w:val="ListParagraph"/>
-        <w:numPr>
-          <w:ilvl w:val="0"/>
-          <w:numId w:val="7"/>
-        </w:numPr>
-        <w:jc w:val="both"/>
-        <w:rPr>
-          <w:sz w:val="36"/>
-          <w:szCs w:val="36"/>
-        </w:rPr>
-      </w:pPr>
-      <w:r>
-        <w:rPr>
-          <w:sz w:val="36"/>
-          <w:szCs w:val="36"/>
-        </w:rPr>
-        <w:t>Dispose unused async calls – cancel streams, timers, or subscriptions.</w:t>
-      </w:r>
-    </w:p>
-    <w:p>
-      <w:pPr>
-        <w:pStyle w:val="ListParagraph"/>
-        <w:numPr>
-          <w:ilvl w:val="0"/>
-          <w:numId w:val="7"/>
-        </w:numPr>
-        <w:jc w:val="both"/>
-        <w:rPr>
-          <w:sz w:val="36"/>
-          <w:szCs w:val="36"/>
-        </w:rPr>
-      </w:pPr>
-      <w:r>
-        <w:rPr>
-          <w:sz w:val="36"/>
-          <w:szCs w:val="36"/>
-        </w:rPr>
-        <w:lastRenderedPageBreak/>
-        <w:t xml:space="preserve">Optimize animations – use </w:t>
-      </w:r>
-      <w:proofErr w:type="spellStart"/>
-      <w:r>
-        <w:rPr>
-          <w:b/>
-          <w:bCs/>
-          <w:sz w:val="36"/>
-          <w:szCs w:val="36"/>
-        </w:rPr>
-        <w:t>TweenAnimationBuilder</w:t>
-      </w:r>
-      <w:proofErr w:type="spellEnd"/>
-      <w:r>
-        <w:rPr>
-          <w:sz w:val="36"/>
-          <w:szCs w:val="36"/>
-        </w:rPr>
-        <w:t xml:space="preserve"> or </w:t>
-      </w:r>
-      <w:proofErr w:type="spellStart"/>
-      <w:r>
-        <w:rPr>
-          <w:b/>
-          <w:bCs/>
-          <w:sz w:val="36"/>
-          <w:szCs w:val="36"/>
-        </w:rPr>
-        <w:t>AnimatedBuilder</w:t>
-      </w:r>
-      <w:proofErr w:type="spellEnd"/>
-      <w:r>
-        <w:rPr>
-          <w:sz w:val="36"/>
-          <w:szCs w:val="36"/>
-        </w:rPr>
-        <w:t>.</w:t>
-      </w:r>
-    </w:p>
-    <w:p>
-      <w:pPr>
-        <w:pStyle w:val="ListParagraph"/>
-        <w:numPr>
-          <w:ilvl w:val="0"/>
-          <w:numId w:val="7"/>
-        </w:numPr>
-        <w:jc w:val="both"/>
-        <w:rPr>
-          <w:sz w:val="36"/>
-          <w:szCs w:val="36"/>
-        </w:rPr>
-      </w:pPr>
-      <w:r>
-        <w:rPr>
-          <w:sz w:val="36"/>
-          <w:szCs w:val="36"/>
-        </w:rPr>
-        <w:t xml:space="preserve">Profile your app – always check memory, rebuilds, and FPS with Flutter </w:t>
-      </w:r>
-      <w:proofErr w:type="spellStart"/>
-      <w:r>
-        <w:rPr>
-          <w:sz w:val="36"/>
-          <w:szCs w:val="36"/>
-        </w:rPr>
-        <w:t>DevTools</w:t>
-      </w:r>
-      <w:proofErr w:type="spellEnd"/>
-      <w:r>
-        <w:rPr>
-          <w:sz w:val="36"/>
-          <w:szCs w:val="36"/>
-        </w:rPr>
-        <w:t>.</w:t>
-      </w:r>
-    </w:p>
-    <w:p>
-      <w:pPr>
-        <w:pStyle w:val="ListParagraph"/>
-        <w:numPr>
-          <w:ilvl w:val="0"/>
-          <w:numId w:val="7"/>
-        </w:numPr>
-        <w:jc w:val="both"/>
-        <w:rPr>
-          <w:sz w:val="36"/>
-          <w:szCs w:val="36"/>
-        </w:rPr>
-      </w:pPr>
-      <w:r>
-        <w:rPr>
-          <w:sz w:val="36"/>
-          <w:szCs w:val="36"/>
-        </w:rPr>
-        <w:t>Advanced Tips</w:t>
-      </w:r>
-    </w:p>
-    <w:p>
-      <w:pPr>
-        <w:pStyle w:val="ListParagraph"/>
-        <w:numPr>
-          <w:ilvl w:val="0"/>
-          <w:numId w:val="7"/>
-        </w:numPr>
-        <w:jc w:val="both"/>
-        <w:rPr>
-          <w:sz w:val="36"/>
-          <w:szCs w:val="36"/>
-        </w:rPr>
-      </w:pPr>
-      <w:r>
-        <w:rPr>
-          <w:sz w:val="36"/>
-          <w:szCs w:val="36"/>
-        </w:rPr>
-        <w:t>Offload heavy computations to Isolates.</w:t>
-      </w:r>
-    </w:p>
-    <w:p>
-      <w:pPr>
-        <w:pStyle w:val="ListParagraph"/>
-        <w:numPr>
-          <w:ilvl w:val="0"/>
-          <w:numId w:val="7"/>
-        </w:numPr>
-        <w:jc w:val="both"/>
-        <w:rPr>
-          <w:sz w:val="36"/>
-          <w:szCs w:val="36"/>
-        </w:rPr>
-      </w:pPr>
-      <w:r>
-        <w:rPr>
-          <w:sz w:val="36"/>
-          <w:szCs w:val="36"/>
-        </w:rPr>
-        <w:t>Optimize database queries – lazy load, index, and limit data.</w:t>
-      </w:r>
-    </w:p>
-    <w:p>
-      <w:pPr>
-        <w:pStyle w:val="ListParagraph"/>
-        <w:numPr>
-          <w:ilvl w:val="0"/>
-          <w:numId w:val="7"/>
-        </w:numPr>
-        <w:jc w:val="both"/>
-        <w:rPr>
-          <w:sz w:val="36"/>
-          <w:szCs w:val="36"/>
-        </w:rPr>
-      </w:pPr>
-      <w:r>
-        <w:rPr>
-          <w:sz w:val="36"/>
-          <w:szCs w:val="36"/>
-        </w:rPr>
-        <w:t>Cache network responses to reduce repeated API calls.</w:t>
-      </w:r>
-    </w:p>
-    <w:p>
-      <w:pPr>
-        <w:pStyle w:val="ListParagraph"/>
-        <w:numPr>
-          <w:ilvl w:val="0"/>
-          <w:numId w:val="7"/>
-        </w:numPr>
-        <w:jc w:val="both"/>
-        <w:rPr>
-          <w:sz w:val="36"/>
-          <w:szCs w:val="36"/>
-        </w:rPr>
-      </w:pPr>
-      <w:r>
-        <w:rPr>
-          <w:sz w:val="36"/>
-          <w:szCs w:val="36"/>
-        </w:rPr>
-        <w:t>Use const &amp; final wisely to prevent unnecessary rebuilds.</w:t>
-      </w:r>
-    </w:p>
-    <w:p>
-      <w:pPr>
-        <w:pStyle w:val="ListParagraph"/>
-        <w:numPr>
-          <w:ilvl w:val="0"/>
-          <w:numId w:val="7"/>
-        </w:numPr>
-        <w:jc w:val="both"/>
-        <w:rPr>
-          <w:sz w:val="36"/>
-          <w:szCs w:val="36"/>
-        </w:rPr>
-      </w:pPr>
-      <w:r>
-        <w:rPr>
-          <w:sz w:val="36"/>
-          <w:szCs w:val="36"/>
-        </w:rPr>
-        <w:t xml:space="preserve">Minimize repaints with </w:t>
-      </w:r>
-      <w:proofErr w:type="spellStart"/>
-      <w:r>
-        <w:rPr>
-          <w:b/>
-          <w:bCs/>
-          <w:sz w:val="36"/>
-          <w:szCs w:val="36"/>
-        </w:rPr>
-        <w:t>RepaintBoundary</w:t>
-      </w:r>
-      <w:proofErr w:type="spellEnd"/>
-      <w:r>
-        <w:rPr>
-          <w:sz w:val="36"/>
-          <w:szCs w:val="36"/>
-        </w:rPr>
-        <w:t xml:space="preserve"> for animations.</w:t>
-      </w:r>
-    </w:p>
-    <w:p>
-      <w:pPr>
-        <w:pStyle w:val="ListParagraph"/>
-        <w:numPr>
-          <w:ilvl w:val="0"/>
-          <w:numId w:val="7"/>
-        </w:numPr>
-        <w:jc w:val="both"/>
-        <w:rPr>
-          <w:sz w:val="36"/>
-          <w:szCs w:val="36"/>
-        </w:rPr>
-      </w:pPr>
-      <w:r>
-        <w:rPr>
-          <w:sz w:val="36"/>
-          <w:szCs w:val="36"/>
-        </w:rPr>
-        <w:t>Avoid blocking the main thread – async everything.</w:t>
-      </w:r>
-    </w:p>
-    <w:p>
-      <w:pPr>
-        <w:pStyle w:val="ListParagraph"/>
-        <w:numPr>
-          <w:ilvl w:val="0"/>
-          <w:numId w:val="7"/>
-        </w:numPr>
-        <w:jc w:val="both"/>
-        <w:rPr>
-          <w:sz w:val="36"/>
-          <w:szCs w:val="36"/>
-        </w:rPr>
-      </w:pPr>
-      <w:r>
-        <w:rPr>
-          <w:sz w:val="36"/>
-          <w:szCs w:val="36"/>
-        </w:rPr>
-        <w:t xml:space="preserve">Optimize image &amp; media loading – placeholders, lazy loading, </w:t>
-      </w:r>
-      <w:proofErr w:type="spellStart"/>
-      <w:r>
-        <w:rPr>
-          <w:b/>
-          <w:bCs/>
-          <w:sz w:val="36"/>
-          <w:szCs w:val="36"/>
-        </w:rPr>
-        <w:t>WebP</w:t>
-      </w:r>
-      <w:proofErr w:type="spellEnd"/>
-      <w:r>
-        <w:rPr>
-          <w:sz w:val="36"/>
-          <w:szCs w:val="36"/>
-        </w:rPr>
-        <w:t>, streaming.</w:t>
-      </w:r>
-    </w:p>
-    <w:p>
-      <w:pPr>
-        <w:pStyle w:val="ListParagraph"/>
-        <w:numPr>
-          <w:ilvl w:val="0"/>
-          <w:numId w:val="7"/>
-        </w:numPr>
-        <w:jc w:val="both"/>
-        <w:rPr>
-          <w:sz w:val="36"/>
-          <w:szCs w:val="36"/>
-        </w:rPr>
-      </w:pPr>
-      <w:r>
-        <w:rPr>
-          <w:sz w:val="36"/>
-          <w:szCs w:val="36"/>
-        </w:rPr>
-        <w:t>Keep learning &amp; updating – Flutter evolves fast; stay on top of best practices.</w:t>
-      </w:r>
-    </w:p>
-    <w:p>
-      <w:pPr>
-        <w:jc w:val="both"/>
-        <w:rPr>
-          <w:sz w:val="36"/>
-          <w:szCs w:val="36"/>
-        </w:rPr>
-      </w:pPr>
-      <w:r>
-        <w:rPr>
-          <w:sz w:val="36"/>
-          <w:szCs w:val="36"/>
-        </w:rPr>
-        <w:t xml:space="preserve"># </w:t>
-      </w:r>
-      <w:r>
-        <w:rPr>
-          <w:rFonts w:ascii="Segoe UI Emoji" w:hAnsi="Segoe UI Emoji" w:cs="Segoe UI Emoji"/>
-          <w:sz w:val="36"/>
-          <w:szCs w:val="36"/>
-        </w:rPr>
-        <w:t>✨</w:t>
-      </w:r>
-      <w:r>
-        <w:rPr>
-          <w:sz w:val="36"/>
-          <w:szCs w:val="36"/>
-        </w:rPr>
-        <w:t xml:space="preserve"> Small changes like these may seem minor, but they dramatically improve app speed, responsiveness, and user experience.</w:t>
-      </w:r>
-    </w:p>
-    <w:p>
-      <w:pPr>
-        <w:jc w:val="both"/>
-        <w:rPr>
-          <w:sz w:val="36"/>
-          <w:szCs w:val="36"/>
-        </w:rPr>
-      </w:pPr>
-    </w:p>
-    <w:p>
-      <w:pPr>
-        <w:jc w:val="both"/>
-        <w:rPr>
           <w:b/>
           <w:bCs/>
           <w:sz w:val="36"/>
@@ -12723,7 +11959,6 @@
           <w:sz w:val="36"/>
           <w:szCs w:val="36"/>
         </w:rPr>
-        <w:lastRenderedPageBreak/>
         <w:t>Fluttercomponentlibrary.com</w:t>
       </w:r>
     </w:p>
@@ -12993,6 +12228,7 @@
           <w:sz w:val="36"/>
           <w:szCs w:val="36"/>
         </w:rPr>
+        <w:lastRenderedPageBreak/>
         <w:t>Choose theme and primary color and also dark mode.</w:t>
       </w:r>
     </w:p>
@@ -13220,7 +12456,6 @@
           <w:sz w:val="36"/>
           <w:szCs w:val="36"/>
         </w:rPr>
-        <w:lastRenderedPageBreak/>
         <w:t xml:space="preserve">Localization setup using </w:t>
       </w:r>
       <w:proofErr w:type="spellStart"/>

</xml_diff>